<commit_message>
Added gryphon and gilgamesh.
</commit_message>
<xml_diff>
--- a/meeting_docs/Meeting_15_04_26.docx
+++ b/meeting_docs/Meeting_15_04_26.docx
@@ -1111,23 +1111,7 @@
           <w:sz w:val="20"/>
           <w:szCs w:val="20"/>
         </w:rPr>
-        <w:t xml:space="preserve">Signe har presentert algoritmen for å avdekke algoritmen for å detektere striper på bilder. Vi har lagt fram at vi ønsker å redusere tidsbruk for analysene. Diskutert mulighet for parallellisering, men har lagt fram at </w:t>
-      </w:r>
-      <w:r>
-        <w:rPr>
-          <w:rFonts w:ascii="Verdana" w:hAnsi="Verdana"/>
-          <w:sz w:val="20"/>
-          <w:szCs w:val="20"/>
-        </w:rPr>
-        <w:t>Python</w:t>
-      </w:r>
-      <w:r>
-        <w:rPr>
-          <w:rFonts w:ascii="Verdana" w:hAnsi="Verdana"/>
-          <w:sz w:val="20"/>
-          <w:szCs w:val="20"/>
-        </w:rPr>
-        <w:t xml:space="preserve"> ikke er veldig egnet til dette.</w:t>
+        <w:t>Signe har presentert algoritmen for å avdekke algoritmen for å detektere striper på bilder. Vi har lagt fram at vi ønsker å redusere tidsbruk for analysene. Diskutert mulighet for parallellisering, men har lagt fram at Python ikke er veldig egnet til dette.</w:t>
       </w:r>
     </w:p>
     <w:p>
@@ -1174,19 +1158,7 @@
           <w:sz w:val="20"/>
           <w:szCs w:val="20"/>
         </w:rPr>
-        <w:t>modu</w:t>
-      </w:r>
-      <w:r>
-        <w:rPr>
-          <w:rFonts w:ascii="Verdana" w:hAnsi="Verdana"/>
-          <w:b/>
-          <w:bCs/>
-          <w:i/>
-          <w:iCs/>
-          <w:sz w:val="20"/>
-          <w:szCs w:val="20"/>
-        </w:rPr>
-        <w:t>le</w:t>
+        <w:t>module</w:t>
       </w:r>
       <w:proofErr w:type="spellEnd"/>
     </w:p>
@@ -1209,23 +1181,7 @@
           <w:sz w:val="20"/>
           <w:szCs w:val="20"/>
         </w:rPr>
-        <w:t xml:space="preserve">August har presentert rapportgenereringsmodulen. Vi har avklart at det er ønskelig at prosjektsensitivitet er lagret på rapporten slik at de kan </w:t>
-      </w:r>
-      <w:r>
-        <w:rPr>
-          <w:rFonts w:ascii="Verdana" w:hAnsi="Verdana"/>
-          <w:sz w:val="20"/>
-          <w:szCs w:val="20"/>
-        </w:rPr>
-        <w:t>gjenskape</w:t>
-      </w:r>
-      <w:r>
-        <w:rPr>
-          <w:rFonts w:ascii="Verdana" w:hAnsi="Verdana"/>
-          <w:sz w:val="20"/>
-          <w:szCs w:val="20"/>
-        </w:rPr>
-        <w:t xml:space="preserve"> prosjektparameter.</w:t>
+        <w:t>August har presentert rapportgenereringsmodulen. Vi har avklart at det er ønskelig at prosjektsensitivitet er lagret på rapporten slik at de kan gjenskape prosjektparameter.</w:t>
       </w:r>
     </w:p>
     <w:p>
@@ -1269,15 +1225,7 @@
           <w:sz w:val="20"/>
           <w:szCs w:val="20"/>
         </w:rPr>
-        <w:t>D</w:t>
-      </w:r>
-      <w:r>
-        <w:rPr>
-          <w:rFonts w:ascii="Verdana" w:hAnsi="Verdana"/>
-          <w:sz w:val="20"/>
-          <w:szCs w:val="20"/>
-        </w:rPr>
-        <w:t xml:space="preserve">e ønsker også kanskje at vi genererer en </w:t>
+        <w:t xml:space="preserve">De ønsker også kanskje at vi genererer en </w:t>
       </w:r>
       <w:proofErr w:type="spellStart"/>
       <w:r>
@@ -1295,39 +1243,7 @@
           <w:sz w:val="20"/>
           <w:szCs w:val="20"/>
         </w:rPr>
-        <w:t xml:space="preserve"> fil med punkter slik at de kan åpne filen i andre programmer</w:t>
-      </w:r>
-      <w:r>
-        <w:rPr>
-          <w:rFonts w:ascii="Verdana" w:hAnsi="Verdana"/>
-          <w:sz w:val="20"/>
-          <w:szCs w:val="20"/>
-        </w:rPr>
-        <w:t>. Dette er derimot</w:t>
-      </w:r>
-      <w:r>
-        <w:rPr>
-          <w:rFonts w:ascii="Verdana" w:hAnsi="Verdana"/>
-          <w:sz w:val="20"/>
-          <w:szCs w:val="20"/>
-        </w:rPr>
-        <w:t xml:space="preserve"> fullt mulig ikke blir en del av prosjektet</w:t>
-      </w:r>
-      <w:r>
-        <w:rPr>
-          <w:rFonts w:ascii="Verdana" w:hAnsi="Verdana"/>
-          <w:sz w:val="20"/>
-          <w:szCs w:val="20"/>
-        </w:rPr>
-        <w:t xml:space="preserve"> pga. tidsbegrensning</w:t>
-      </w:r>
-      <w:r>
-        <w:rPr>
-          <w:rFonts w:ascii="Verdana" w:hAnsi="Verdana"/>
-          <w:sz w:val="20"/>
-          <w:szCs w:val="20"/>
-        </w:rPr>
-        <w:t>.</w:t>
+        <w:t xml:space="preserve"> fil med punkter slik at de kan åpne filen i andre programmer. Dette er derimot fullt mulig ikke blir en del av prosjektet pga. tidsbegrensning.</w:t>
       </w:r>
     </w:p>
     <w:p>
@@ -1350,41 +1266,8 @@
           <w:szCs w:val="20"/>
         </w:rPr>
         <w:lastRenderedPageBreak/>
-        <w:t>B</w:t>
-      </w:r>
-      <w:r>
-        <w:rPr>
-          <w:rFonts w:ascii="Verdana" w:hAnsi="Verdana"/>
-          <w:sz w:val="20"/>
-          <w:szCs w:val="20"/>
-        </w:rPr>
-        <w:t>ør skrive i rapporten at kunde ønsket dette</w:t>
-      </w:r>
-      <w:r>
-        <w:rPr>
-          <w:rFonts w:ascii="Verdana" w:hAnsi="Verdana"/>
-          <w:sz w:val="20"/>
-          <w:szCs w:val="20"/>
-        </w:rPr>
-        <w:t>,</w:t>
-      </w:r>
-      <w:r>
-        <w:rPr>
-          <w:rFonts w:ascii="Verdana" w:hAnsi="Verdana"/>
-          <w:sz w:val="20"/>
-          <w:szCs w:val="20"/>
-        </w:rPr>
-        <w:t xml:space="preserve"> samt at vi kan utvide programmet i ettertid for å få denne funksjonaliteten implementert.</w:t>
-      </w:r>
-    </w:p>
-    <w:p>
-      <w:pPr>
-        <w:rPr>
-          <w:rFonts w:ascii="Verdana" w:hAnsi="Verdana"/>
-          <w:sz w:val="20"/>
-          <w:szCs w:val="20"/>
-        </w:rPr>
-      </w:pPr>
+        <w:t>Bør skrive i rapporten at kunde ønsket dette, samt at vi kan utvide programmet i ettertid for å få denne funksjonaliteten implementert.</w:t>
+      </w:r>
     </w:p>
     <w:p>
       <w:pPr>
@@ -1470,15 +1353,7 @@
           <w:sz w:val="20"/>
           <w:szCs w:val="20"/>
         </w:rPr>
-        <w:t>De syntes det er greit at det tar tid å analysere bilder</w:t>
-      </w:r>
-      <w:r>
-        <w:rPr>
-          <w:rFonts w:ascii="Verdana" w:hAnsi="Verdana"/>
-          <w:sz w:val="20"/>
-          <w:szCs w:val="20"/>
-        </w:rPr>
-        <w:t>, og at vi hadde gjort en god jobb med å kutte det ned</w:t>
+        <w:t>De syntes det er greit at det tar tid å analysere bilder, og at vi hadde gjort en god jobb med å kutte det ned</w:t>
       </w:r>
     </w:p>
     <w:p>
@@ -1534,75 +1409,7 @@
           <w:sz w:val="20"/>
           <w:szCs w:val="20"/>
         </w:rPr>
-        <w:t>Ønsker å få ramme på faktisk bilde. Ønsker "</w:t>
-      </w:r>
-      <w:proofErr w:type="spellStart"/>
-      <w:r>
-        <w:rPr>
-          <w:rFonts w:ascii="Verdana" w:hAnsi="Verdana"/>
-          <w:sz w:val="20"/>
-          <w:szCs w:val="20"/>
-        </w:rPr>
-        <w:t>toolbar</w:t>
-      </w:r>
-      <w:proofErr w:type="spellEnd"/>
-      <w:r>
-        <w:rPr>
-          <w:rFonts w:ascii="Verdana" w:hAnsi="Verdana"/>
-          <w:sz w:val="20"/>
-          <w:szCs w:val="20"/>
-        </w:rPr>
-        <w:t xml:space="preserve">" eller noe </w:t>
-      </w:r>
-      <w:r>
-        <w:rPr>
-          <w:rFonts w:ascii="Verdana" w:hAnsi="Verdana"/>
-          <w:sz w:val="20"/>
-          <w:szCs w:val="20"/>
-        </w:rPr>
-        <w:t>liknende</w:t>
-      </w:r>
-      <w:r>
-        <w:rPr>
-          <w:rFonts w:ascii="Verdana" w:hAnsi="Verdana"/>
-          <w:sz w:val="20"/>
-          <w:szCs w:val="20"/>
-        </w:rPr>
-        <w:t xml:space="preserve"> for at de skal kunne velge om ramme er synlig eller ikke.</w:t>
-      </w:r>
-    </w:p>
-    <w:p>
-      <w:pPr>
-        <w:rPr>
-          <w:rFonts w:ascii="Verdana" w:hAnsi="Verdana"/>
-          <w:sz w:val="20"/>
-          <w:szCs w:val="20"/>
-        </w:rPr>
-      </w:pPr>
-    </w:p>
-    <w:p>
-      <w:pPr>
-        <w:rPr>
-          <w:rFonts w:ascii="Verdana" w:hAnsi="Verdana"/>
-          <w:b/>
-          <w:bCs/>
-          <w:i/>
-          <w:iCs/>
-          <w:sz w:val="20"/>
-          <w:szCs w:val="20"/>
-        </w:rPr>
-      </w:pPr>
-      <w:r>
-        <w:rPr>
-          <w:rFonts w:ascii="Verdana" w:hAnsi="Verdana"/>
-          <w:b/>
-          <w:bCs/>
-          <w:i/>
-          <w:iCs/>
-          <w:sz w:val="20"/>
-          <w:szCs w:val="20"/>
-        </w:rPr>
-        <w:t>Presentert videre plan</w:t>
+        <w:t xml:space="preserve">Ønsker å få ramme på faktisk bilde. </w:t>
       </w:r>
     </w:p>
     <w:p>
@@ -1624,7 +1431,7 @@
           <w:sz w:val="20"/>
           <w:szCs w:val="20"/>
         </w:rPr>
-        <w:t xml:space="preserve">Presentert at vi blir å fokusere på å ordne opp i uferdige ting samt å sy sammen siste </w:t>
+        <w:t>Ønsker "</w:t>
       </w:r>
       <w:proofErr w:type="spellStart"/>
       <w:r>
@@ -1633,7 +1440,7 @@
           <w:sz w:val="20"/>
           <w:szCs w:val="20"/>
         </w:rPr>
-        <w:t>features</w:t>
+        <w:t>toolbar</w:t>
       </w:r>
       <w:proofErr w:type="spellEnd"/>
       <w:r>
@@ -1642,7 +1449,41 @@
           <w:sz w:val="20"/>
           <w:szCs w:val="20"/>
         </w:rPr>
-        <w:t>.</w:t>
+        <w:t>" eller noe liknende for at de skal kunne velge om ramme er synlig eller ikke.</w:t>
+      </w:r>
+    </w:p>
+    <w:p>
+      <w:pPr>
+        <w:rPr>
+          <w:rFonts w:ascii="Verdana" w:hAnsi="Verdana"/>
+          <w:sz w:val="20"/>
+          <w:szCs w:val="20"/>
+        </w:rPr>
+      </w:pPr>
+    </w:p>
+    <w:p>
+      <w:pPr>
+        <w:rPr>
+          <w:rFonts w:ascii="Verdana" w:hAnsi="Verdana"/>
+          <w:b/>
+          <w:bCs/>
+          <w:i/>
+          <w:iCs/>
+          <w:sz w:val="20"/>
+          <w:szCs w:val="20"/>
+        </w:rPr>
+      </w:pPr>
+      <w:r>
+        <w:rPr>
+          <w:rFonts w:ascii="Verdana" w:hAnsi="Verdana"/>
+          <w:b/>
+          <w:bCs/>
+          <w:i/>
+          <w:iCs/>
+          <w:sz w:val="20"/>
+          <w:szCs w:val="20"/>
+        </w:rPr>
+        <w:t>Presentert videre plan</w:t>
       </w:r>
     </w:p>
     <w:p>
@@ -1664,7 +1505,7 @@
           <w:sz w:val="20"/>
           <w:szCs w:val="20"/>
         </w:rPr>
-        <w:t xml:space="preserve">Blir ikke å legge til mange nye </w:t>
+        <w:t xml:space="preserve">Presentert at vi blir å fokusere på å ordne opp i uferdige ting samt å sy sammen siste </w:t>
       </w:r>
       <w:proofErr w:type="spellStart"/>
       <w:r>
@@ -1682,51 +1523,8 @@
           <w:sz w:val="20"/>
           <w:szCs w:val="20"/>
         </w:rPr>
-        <w:t>. Blir å fokusere mye på rapportskriving framover.</w:t>
-      </w:r>
-    </w:p>
-    <w:p>
-      <w:pPr>
-        <w:rPr>
-          <w:rFonts w:ascii="Verdana" w:hAnsi="Verdana"/>
-          <w:sz w:val="20"/>
-          <w:szCs w:val="20"/>
-        </w:rPr>
-      </w:pPr>
-    </w:p>
-    <w:p>
-      <w:pPr>
-        <w:rPr>
-          <w:rFonts w:ascii="Verdana" w:hAnsi="Verdana"/>
-          <w:b/>
-          <w:bCs/>
-          <w:i/>
-          <w:iCs/>
-          <w:sz w:val="20"/>
-          <w:szCs w:val="20"/>
-        </w:rPr>
-      </w:pPr>
-      <w:r>
-        <w:rPr>
-          <w:rFonts w:ascii="Verdana" w:hAnsi="Verdana"/>
-          <w:b/>
-          <w:bCs/>
-          <w:i/>
-          <w:iCs/>
-          <w:sz w:val="20"/>
-          <w:szCs w:val="20"/>
-        </w:rPr>
-        <w:t>Avklaringer</w:t>
-      </w:r>
-    </w:p>
-    <w:p>
-      <w:pPr>
-        <w:rPr>
-          <w:rFonts w:ascii="Verdana" w:hAnsi="Verdana"/>
-          <w:sz w:val="20"/>
-          <w:szCs w:val="20"/>
-        </w:rPr>
-      </w:pPr>
+        <w:t>.</w:t>
+      </w:r>
     </w:p>
     <w:p>
       <w:pPr>
@@ -1747,56 +1545,69 @@
           <w:sz w:val="20"/>
           <w:szCs w:val="20"/>
         </w:rPr>
-        <w:t xml:space="preserve">Presentert at maskinlæring ikke gir mening </w:t>
-      </w:r>
-      <w:r>
-        <w:rPr>
-          <w:rFonts w:ascii="Verdana" w:hAnsi="Verdana"/>
-          <w:sz w:val="20"/>
-          <w:szCs w:val="20"/>
-        </w:rPr>
-        <w:t>i dette prosjektet,</w:t>
-      </w:r>
-      <w:r>
-        <w:rPr>
-          <w:rFonts w:ascii="Verdana" w:hAnsi="Verdana"/>
-          <w:sz w:val="20"/>
-          <w:szCs w:val="20"/>
-        </w:rPr>
-        <w:t xml:space="preserve"> med mindre man har avviksbilder man kan trene på</w:t>
-      </w:r>
-      <w:r>
-        <w:rPr>
-          <w:rFonts w:ascii="Verdana" w:hAnsi="Verdana"/>
-          <w:sz w:val="20"/>
-          <w:szCs w:val="20"/>
-        </w:rPr>
-        <w:t>, ettersom</w:t>
-      </w:r>
-      <w:r>
-        <w:rPr>
-          <w:rFonts w:ascii="Verdana" w:hAnsi="Verdana"/>
-          <w:sz w:val="20"/>
-          <w:szCs w:val="20"/>
-        </w:rPr>
-        <w:t xml:space="preserve"> Norges natur er veldig varierende. Dersom man tar vare på </w:t>
-      </w:r>
-      <w:r>
-        <w:rPr>
-          <w:rFonts w:ascii="Verdana" w:hAnsi="Verdana"/>
-          <w:sz w:val="20"/>
-          <w:szCs w:val="20"/>
-        </w:rPr>
-        <w:t>avviksbildene,</w:t>
-      </w:r>
-      <w:r>
-        <w:rPr>
-          <w:rFonts w:ascii="Verdana" w:hAnsi="Verdana"/>
-          <w:sz w:val="20"/>
-          <w:szCs w:val="20"/>
-        </w:rPr>
-        <w:t xml:space="preserve"> kan man potensielt trene opp en modell for å detektere avvik. </w:t>
-      </w:r>
+        <w:t xml:space="preserve">Blir ikke å legge til mange nye </w:t>
+      </w:r>
+      <w:proofErr w:type="spellStart"/>
+      <w:r>
+        <w:rPr>
+          <w:rFonts w:ascii="Verdana" w:hAnsi="Verdana"/>
+          <w:sz w:val="20"/>
+          <w:szCs w:val="20"/>
+        </w:rPr>
+        <w:t>features</w:t>
+      </w:r>
+      <w:proofErr w:type="spellEnd"/>
+      <w:r>
+        <w:rPr>
+          <w:rFonts w:ascii="Verdana" w:hAnsi="Verdana"/>
+          <w:sz w:val="20"/>
+          <w:szCs w:val="20"/>
+        </w:rPr>
+        <w:t>. Blir å fokusere mye på rapportskriving framover.</w:t>
+      </w:r>
+    </w:p>
+    <w:p>
+      <w:pPr>
+        <w:rPr>
+          <w:rFonts w:ascii="Verdana" w:hAnsi="Verdana"/>
+          <w:sz w:val="20"/>
+          <w:szCs w:val="20"/>
+        </w:rPr>
+      </w:pPr>
+    </w:p>
+    <w:p>
+      <w:pPr>
+        <w:rPr>
+          <w:rFonts w:ascii="Verdana" w:hAnsi="Verdana"/>
+          <w:b/>
+          <w:bCs/>
+          <w:i/>
+          <w:iCs/>
+          <w:sz w:val="20"/>
+          <w:szCs w:val="20"/>
+        </w:rPr>
+      </w:pPr>
+      <w:r>
+        <w:rPr>
+          <w:rFonts w:ascii="Verdana" w:hAnsi="Verdana"/>
+          <w:b/>
+          <w:bCs/>
+          <w:i/>
+          <w:iCs/>
+          <w:sz w:val="20"/>
+          <w:szCs w:val="20"/>
+        </w:rPr>
+        <w:t>Avklaringer</w:t>
+      </w:r>
+    </w:p>
+    <w:p>
+      <w:pPr>
+        <w:rPr>
+          <w:rFonts w:ascii="Verdana" w:hAnsi="Verdana"/>
+          <w:sz w:val="20"/>
+          <w:szCs w:val="20"/>
+        </w:rPr>
+      </w:pPr>
     </w:p>
     <w:p>
       <w:pPr>
@@ -1817,23 +1628,7 @@
           <w:sz w:val="20"/>
           <w:szCs w:val="20"/>
         </w:rPr>
-        <w:t>Har presentert at framtidig utbedring bør kanskje inneholde høydedata for å ortograf</w:t>
-      </w:r>
-      <w:r>
-        <w:rPr>
-          <w:rFonts w:ascii="Verdana" w:hAnsi="Verdana"/>
-          <w:sz w:val="20"/>
-          <w:szCs w:val="20"/>
-        </w:rPr>
-        <w:t>iske</w:t>
-      </w:r>
-      <w:r>
-        <w:rPr>
-          <w:rFonts w:ascii="Verdana" w:hAnsi="Verdana"/>
-          <w:sz w:val="20"/>
-          <w:szCs w:val="20"/>
-        </w:rPr>
-        <w:t xml:space="preserve"> datasettene slik at man kan korrekt bruke vannpolygonene. </w:t>
+        <w:t xml:space="preserve">Presentert at maskinlæring ikke gir mening i dette prosjektet, med mindre man har avviksbilder man kan trene på, ettersom Norges natur er veldig varierende. Dersom man tar vare på avviksbildene, kan man potensielt trene opp en modell for å detektere avvik. </w:t>
       </w:r>
     </w:p>
     <w:p>
@@ -1855,23 +1650,29 @@
           <w:sz w:val="20"/>
           <w:szCs w:val="20"/>
         </w:rPr>
-        <w:t xml:space="preserve">Man kan også bruke denne ortograferte dataen for å regne ut skygger osv. som kan avdekke om et bilde bør ha skygger eller ikke basert på </w:t>
-      </w:r>
-      <w:r>
-        <w:rPr>
-          <w:rFonts w:ascii="Verdana" w:hAnsi="Verdana"/>
-          <w:sz w:val="20"/>
-          <w:szCs w:val="20"/>
-        </w:rPr>
-        <w:t xml:space="preserve">tidspunkt </w:t>
-      </w:r>
-      <w:r>
-        <w:rPr>
-          <w:rFonts w:ascii="Verdana" w:hAnsi="Verdana"/>
-          <w:sz w:val="20"/>
-          <w:szCs w:val="20"/>
-        </w:rPr>
-        <w:t>osv.</w:t>
+        <w:t xml:space="preserve">Har presentert at framtidig utbedring bør kanskje inneholde høydedata for å ortografiske datasettene slik at man kan korrekt bruke vannpolygonene. </w:t>
+      </w:r>
+    </w:p>
+    <w:p>
+      <w:pPr>
+        <w:pStyle w:val="ListParagraph"/>
+        <w:numPr>
+          <w:ilvl w:val="0"/>
+          <w:numId w:val="11"/>
+        </w:numPr>
+        <w:rPr>
+          <w:rFonts w:ascii="Verdana" w:hAnsi="Verdana"/>
+          <w:sz w:val="20"/>
+          <w:szCs w:val="20"/>
+        </w:rPr>
+      </w:pPr>
+      <w:r>
+        <w:rPr>
+          <w:rFonts w:ascii="Verdana" w:hAnsi="Verdana"/>
+          <w:sz w:val="20"/>
+          <w:szCs w:val="20"/>
+        </w:rPr>
+        <w:t>Man kan også bruke denne ortograferte dataen for å regne ut skygger osv. som kan avdekke om et bilde bør ha skygger eller ikke basert på tidspunkt osv.</w:t>
       </w:r>
     </w:p>
     <w:p>
@@ -3434,6 +3235,7 @@
   <w:style w:type="character" w:default="1" w:styleId="DefaultParagraphFont">
     <w:name w:val="Default Paragraph Font"/>
     <w:uiPriority w:val="1"/>
+    <w:semiHidden/>
     <w:unhideWhenUsed/>
   </w:style>
   <w:style w:type="table" w:default="1" w:styleId="TableNormal">

</xml_diff>